<commit_message>
fix(templates): render correspondent BIC in detailed and minimal
- only default.docx had the correspondent BIC block
- adds the same conditional line to detailed and minimal, with a render
  test over every built-in template
</commit_message>
<xml_diff>
--- a/templates/detailed.docx
+++ b/templates/detailed.docx
@@ -982,6 +982,44 @@
           <w:p>
             <w:r>
               <w:t xml:space="preserve">{bank.bic}</w:t>
+            </w:r>
+          </w:p>
+        </w:tc>
+      </w:tr>
+      <w:tr>
+        <w:tc>
+          <w:tcPr>
+            <w:tcW w:type="dxa" w:w="2000"/>
+            <w:tcBorders>
+              <w:top w:val="none" w:color="FFFFFF" w:sz="0"/>
+              <w:left w:val="none" w:color="FFFFFF" w:sz="0"/>
+              <w:bottom w:val="none" w:color="FFFFFF" w:sz="0"/>
+              <w:right w:val="none" w:color="FFFFFF" w:sz="0"/>
+            </w:tcBorders>
+          </w:tcPr>
+          <w:p>
+            <w:r>
+              <w:rPr>
+                <w:b/>
+                <w:bCs/>
+              </w:rPr>
+              <w:t xml:space="preserve">{#bank.correspondentBic}{translations.correspondentBic}</w:t>
+            </w:r>
+          </w:p>
+        </w:tc>
+        <w:tc>
+          <w:tcPr>
+            <w:tcW w:type="dxa" w:w="7600"/>
+            <w:tcBorders>
+              <w:top w:val="none" w:color="FFFFFF" w:sz="0"/>
+              <w:left w:val="none" w:color="FFFFFF" w:sz="0"/>
+              <w:bottom w:val="none" w:color="FFFFFF" w:sz="0"/>
+              <w:right w:val="none" w:color="FFFFFF" w:sz="0"/>
+            </w:tcBorders>
+          </w:tcPr>
+          <w:p>
+            <w:r>
+              <w:t xml:space="preserve">{bank.correspondentBic}{/bank.correspondentBic}</w:t>
             </w:r>
           </w:p>
         </w:tc>

</xml_diff>